<commit_message>
Durably restage corrected Manual 05 publication package
</commit_message>
<xml_diff>
--- a/03-assurance-and-audit/AI_Auditing_and_Assurance/publication/Manual_05_AI_Auditing_and_Assurance_ES-419.docx
+++ b/03-assurance-and-audit/AI_Auditing_and_Assurance/publication/Manual_05_AI_Auditing_and_Assurance_ES-419.docx
@@ -41,7 +41,7 @@
           <w:sz w:val="17"/>
           <w:lang w:val="es-419"/>
         </w:rPr>
-        <w:t>Revisión de fuente controlada: 647eab3dda4bce3acadc9cd5a0874b354b360935 | Idioma: es-419 | controlled assurance baseline and source watch retained.</w:t>
+        <w:t>Revisión de fuente controlada: d42b12447646993c54caade2b399efd4fb37f8d9 | Idioma: es-419 | se conservan la línea base de aseguramiento controlada y la vigilancia de fuentes.</w:t>
       </w:r>
     </w:p>
     <w:p>
@@ -572,7 +572,7 @@
           <w:rFonts w:ascii="Arial" w:hAnsi="Arial" w:eastAsia="Arial"/>
           <w:lang w:val="es-419"/>
         </w:rPr>
-        <w:t>Figure 1. Implementation memory graphic</w:t>
+        <w:t>Figura 1. Gráfico de memoria de implementación</w:t>
       </w:r>
     </w:p>
     <w:p>
@@ -1152,7 +1152,7 @@
           <w:rFonts w:ascii="Arial" w:hAnsi="Arial" w:eastAsia="Arial"/>
           <w:lang w:val="es-419"/>
         </w:rPr>
-        <w:t>Figure 2. Implementation memory graphic</w:t>
+        <w:t>Figura 2. Gráfico de memoria de implementación</w:t>
       </w:r>
     </w:p>
     <w:p>
@@ -1829,7 +1829,7 @@
           <w:rFonts w:ascii="Arial" w:hAnsi="Arial" w:eastAsia="Arial"/>
           <w:lang w:val="es-419"/>
         </w:rPr>
-        <w:t>Figure 3. Implementation memory graphic</w:t>
+        <w:t>Figura 3. Gráfico de memoria de implementación</w:t>
       </w:r>
     </w:p>
     <w:p>

</xml_diff>